<commit_message>
Add reproducibility package: launch files, scripts, experiment data, REPRODUCE.md
- reproducibility/: complete reproduction package
  - launch/: vgr_ablation.launch.py (our method), vgr_gsl_pmfs.launch.py (baselines + wind_value_server)
  - scripts/: run_all_experiments.sh (one-click), run_pmfs.sh (PMFS batch)
  - data/: 160-run benchmark, 70-run ablation, PMFS endpoint results
  - REPRODUCE.md: full setup guide with DDS fix notes
- experiment_results/: updated with PMFS endpoint distance data
- Updated papers with corrected PMFS dual-metric analysis
</commit_message>
<xml_diff>
--- a/ASCi/论文进展汇报_20260709.docx
+++ b/ASCi/论文进展汇报_20260709.docx
@@ -43,22 +43,227 @@
         <w:pStyle w:val="Heading1"/>
       </w:pPr>
       <w:r>
-        <w:t>一、我做的是什么？</w:t>
+        <w:t>核心问题与回答</w:t>
+      </w:r>
+    </w:p>
+    <w:p>
+      <w:pPr>
+        <w:pStyle w:val="Heading2"/>
+      </w:pPr>
+      <w:r>
+        <w:t>一、明确解决的原生科学问题</w:t>
       </w:r>
     </w:p>
     <w:p>
       <w:r>
-        <w:t>简单说：用无人机在室内找气体泄漏源在哪。</w:t>
+        <w:t>室内低风速环境下，无人机如何自动找到气体泄漏源？</w:t>
       </w:r>
     </w:p>
     <w:p>
       <w:r>
-        <w:t>场景是这样的——工厂或灾后室内有毒气体泄漏了，我们需要派一架无人机进去，带着气体传感器和风速计，自动找到气体是从哪里泄漏出来的。</w:t>
+        <w:t>具体来说是两个子问题：</w:t>
       </w:r>
     </w:p>
     <w:p>
       <w:r>
-        <w:t>这个问题的难点在于：室内风速很低（不到0.1米/秒），气体不是均匀扩散的，而是一团一团地飘过来（叫"丝状体"），传感器经常检测不到气体，偶尔突然检测到一下。就像你在大雾天找一个喷烟的烟囱，但烟是断断续续的，你经常看不到烟。</w:t>
+        <w:t>1. 找不准：室内气体不是均匀扩散的，而是一团一团飘过来（丝状体），但现有方法都假设气体像烟雾一样均匀扩散（高斯模型），模型跟实际对不上，导致推算出来的“源在哪”是错的。</w:t>
+      </w:r>
+    </w:p>
+    <w:p>
+      <w:r>
+        <w:t>2. 不知道什么时候停：现有方法跑够固定时间就停，或者靠感觉，没有数学保证说“我已经找到了，可以停了”。</w:t>
+      </w:r>
+    </w:p>
+    <w:p>
+      <w:pPr>
+        <w:pStyle w:val="Heading2"/>
+      </w:pPr>
+      <w:r>
+        <w:t>二、现有研究工作如何解决的</w:t>
+      </w:r>
+    </w:p>
+    <w:p>
+      <w:r>
+        <w:t>目前主流三种方法：</w:t>
+      </w:r>
+    </w:p>
+    <w:tbl>
+      <w:tblPr>
+        <w:tblStyle w:val="LightGrid-Accent1"/>
+        <w:tblW w:type="auto" w:w="0"/>
+        <w:tblLook w:firstColumn="1" w:firstRow="1" w:lastColumn="0" w:lastRow="0" w:noHBand="0" w:noVBand="1" w:val="04A0"/>
+      </w:tblPr>
+      <w:tblGrid>
+        <w:gridCol w:w="2880"/>
+        <w:gridCol w:w="2880"/>
+        <w:gridCol w:w="2880"/>
+      </w:tblGrid>
+      <w:tr>
+        <w:tc>
+          <w:tcPr>
+            <w:tcW w:type="dxa" w:w="2880"/>
+          </w:tcPr>
+          <w:p>
+            <w:r>
+              <w:t>方法</w:t>
+            </w:r>
+          </w:p>
+        </w:tc>
+        <w:tc>
+          <w:tcPr>
+            <w:tcW w:type="dxa" w:w="2880"/>
+          </w:tcPr>
+          <w:p>
+            <w:r>
+              <w:t>思路</w:t>
+            </w:r>
+          </w:p>
+        </w:tc>
+        <w:tc>
+          <w:tcPr>
+            <w:tcW w:type="dxa" w:w="2880"/>
+          </w:tcPr>
+          <w:p>
+            <w:r>
+              <w:t>怎么找的</w:t>
+            </w:r>
+          </w:p>
+        </w:tc>
+      </w:tr>
+      <w:tr>
+        <w:tc>
+          <w:tcPr>
+            <w:tcW w:type="dxa" w:w="2880"/>
+          </w:tcPr>
+          <w:p>
+            <w:r>
+              <w:t>SurgeCast (2025 RA-L)</w:t>
+            </w:r>
+          </w:p>
+        </w:tc>
+        <w:tc>
+          <w:tcPr>
+            <w:tcW w:type="dxa" w:w="2880"/>
+          </w:tcPr>
+          <w:p>
+            <w:r>
+              <w:t>顺着风往回追</w:t>
+            </w:r>
+          </w:p>
+        </w:tc>
+        <w:tc>
+          <w:tcPr>
+            <w:tcW w:type="dxa" w:w="2880"/>
+          </w:tcPr>
+          <w:p>
+            <w:r>
+              <w:t>检测到气体就逆风走，丢了信号就来回扫描</w:t>
+            </w:r>
+          </w:p>
+        </w:tc>
+      </w:tr>
+      <w:tr>
+        <w:tc>
+          <w:tcPr>
+            <w:tcW w:type="dxa" w:w="2880"/>
+          </w:tcPr>
+          <w:p>
+            <w:r>
+              <w:t>GrGSL (2025 RA-L)</w:t>
+            </w:r>
+          </w:p>
+        </w:tc>
+        <w:tc>
+          <w:tcPr>
+            <w:tcW w:type="dxa" w:w="2880"/>
+          </w:tcPr>
+          <w:p>
+            <w:r>
+              <w:t>画浓度地图</w:t>
+            </w:r>
+          </w:p>
+        </w:tc>
+        <w:tc>
+          <w:tcPr>
+            <w:tcW w:type="dxa" w:w="2880"/>
+          </w:tcPr>
+          <w:p>
+            <w:r>
+              <w:t>用高斯回归建浓度地图，往最浓的地方走</w:t>
+            </w:r>
+          </w:p>
+        </w:tc>
+      </w:tr>
+      <w:tr>
+        <w:tc>
+          <w:tcPr>
+            <w:tcW w:type="dxa" w:w="2880"/>
+          </w:tcPr>
+          <w:p>
+            <w:r>
+              <w:t>PMFS (2023 TRO)</w:t>
+            </w:r>
+          </w:p>
+        </w:tc>
+        <w:tc>
+          <w:tcPr>
+            <w:tcW w:type="dxa" w:w="2880"/>
+          </w:tcPr>
+          <w:p>
+            <w:r>
+              <w:t>模拟气体扩散</w:t>
+            </w:r>
+          </w:p>
+        </w:tc>
+        <w:tc>
+          <w:tcPr>
+            <w:tcW w:type="dxa" w:w="2880"/>
+          </w:tcPr>
+          <w:p>
+            <w:r>
+              <w:t>用粒子模拟气体怎么飘，反推源在哪</w:t>
+            </w:r>
+          </w:p>
+        </w:tc>
+      </w:tr>
+    </w:tbl>
+    <w:p/>
+    <w:p>
+      <w:r>
+        <w:t>这三种方法都是基于标准贝叶斯推理——假设一个气体扩散模型，用观测数据不断更新“源在哪”的概率分布。</w:t>
+      </w:r>
+    </w:p>
+    <w:p>
+      <w:pPr>
+        <w:pStyle w:val="Heading2"/>
+      </w:pPr>
+      <w:r>
+        <w:t>三、现有方法需要改进的地方</w:t>
+      </w:r>
+    </w:p>
+    <w:p>
+      <w:r>
+        <w:t>根本问题：模型假设和实际不匹配。</w:t>
+      </w:r>
+    </w:p>
+    <w:p>
+      <w:r>
+        <w:t>1. 模型误设（最核心）：三种方法都假设气体按高斯模型扩散，但实际室内气体是一团一团的间歇性到达。就像用“直线传播”的模型去预测弯路的车，模型本身就是错的。</w:t>
+      </w:r>
+    </w:p>
+    <w:p>
+      <w:r>
+        <w:t>2. 零信号没用上：传感器大部分时间检测不到气体（检测率&lt;20%），现有方法把“没检测到”当“没有信息”丢掉了。但实际上“在某个位置没检测到气体”本身排除了“源就在旁边”的可能性，是有价值的信息。</w:t>
+      </w:r>
+    </w:p>
+    <w:p>
+      <w:r>
+        <w:t>3. 没有停止保证：不知道什么时候该停。要么白跑浪费时间，要么提前停了没找到。</w:t>
+      </w:r>
+    </w:p>
+    <w:p>
+      <w:r>
+        <w:t>4. 只能在地面找：PMFS、GrGSL、SurgeCast都是地面机器人方法，源在空中就完全找不到。</w:t>
       </w:r>
     </w:p>
     <w:p>
@@ -66,63 +271,7 @@
         <w:pStyle w:val="Heading1"/>
       </w:pPr>
       <w:r>
-        <w:t>二、现有方法有什么问题？</w:t>
-      </w:r>
-    </w:p>
-    <w:p>
-      <w:r>
-        <w:t>现在主流的三种方法都有硬伤：</w:t>
-      </w:r>
-    </w:p>
-    <w:p>
-      <w:pPr>
-        <w:pStyle w:val="ListBullet"/>
-      </w:pPr>
-      <w:r>
-        <w:t>1. SurgeCast（2025年RA-L）：</w:t>
-      </w:r>
-      <w:r>
-        <w:t>顺着风往回找。问题：一旦丢了气体信号就迷路，成功率只有30%。</w:t>
-      </w:r>
-    </w:p>
-    <w:p>
-      <w:pPr>
-        <w:pStyle w:val="ListBullet"/>
-      </w:pPr>
-      <w:r>
-        <w:t>2. GrGSL（2025年RA-L）：</w:t>
-      </w:r>
-      <w:r>
-        <w:t>用高斯回归建浓度地图。问题：假设气体是均匀扩散的，但实际是一团一团的，模型不对。</w:t>
-      </w:r>
-    </w:p>
-    <w:p>
-      <w:pPr>
-        <w:pStyle w:val="ListBullet"/>
-      </w:pPr>
-      <w:r>
-        <w:t>3. PMFS（2023年TRO）：</w:t>
-      </w:r>
-      <w:r>
-        <w:t>用粒子模拟扩散。问题：需要风场数据，但室内风速太低测不准，直接失效（成功率0%）。</w:t>
-      </w:r>
-    </w:p>
-    <w:p>
-      <w:r>
-        <w:t>总结：现有方法有两个根本问题——①用的数学模型跟实际气体扩散不匹配（模型误设），②不知道什么时候该停（没有停止准则）。</w:t>
-      </w:r>
-    </w:p>
-    <w:p>
-      <w:pPr>
-        <w:pStyle w:val="Heading1"/>
-      </w:pPr>
-      <w:r>
-        <w:t>三、我用什么方法解决？</w:t>
-      </w:r>
-    </w:p>
-    <w:p>
-      <w:r>
-        <w:t>我的方法叫"鲁棒估计-决策协同框架"，名字听着复杂，其实就是两件事一起干：</w:t>
+        <w:t>四、我用什么方法解决</w:t>
       </w:r>
     </w:p>
     <w:p>
@@ -130,33 +279,27 @@
         <w:pStyle w:val="Heading2"/>
       </w:pPr>
       <w:r>
-        <w:t>创新点1：用"宽容的"贝叶斯推理替代"死板的"贝叶斯推理</w:t>
+        <w:t>创新点1：用“宽容的”贝叶斯推理替代“死板的”贝叶斯推理</w:t>
       </w:r>
     </w:p>
     <w:p>
       <w:r>
-        <w:t>打个比方：标准贝叶斯推理就像一个特别较真的人，模型说气体应该这样分布，实际不是，它就推导出错误结论还很自信。我用的GBI（广义贝叶斯推理）就像一个"知道自己的模型不完美"的人，会根据风场是否稳定来决定"这次观测值不值得信任"：</w:t>
-      </w:r>
-    </w:p>
-    <w:p>
-      <w:pPr>
-        <w:pStyle w:val="ListBullet"/>
-      </w:pPr>
-      <w:r>
-        <w:t>• 检测到气体 + 风向稳定 → 高信任（η=0.6~0.9，强更新）</w:t>
-      </w:r>
-    </w:p>
-    <w:p>
-      <w:pPr>
-        <w:pStyle w:val="ListBullet"/>
-      </w:pPr>
-      <w:r>
-        <w:t>• 没检测到气体 + 风向混乱 → 低信任（η=0.15~0.5，弱更新）</w:t>
+        <w:t>标准贝叶斯推理就像一个特别较真的人，模型说气体应该这样分布，实际不是，它就推导出错误结论还很自信。我用的GBI会根据风场是否稳定来决定“这次观测值值不值得信任”：</w:t>
       </w:r>
     </w:p>
     <w:p>
       <w:r>
-        <w:t>这个"信任度"不是我拍脑袋调的参数，而是由风场置信度自动计算的。论文里证明了这样做后验会以指数速度收敛到正确位置。</w:t>
+        <w:t xml:space="preserve">  • 检测到气体 + 风向稳定 → 高信任（强更新）</w:t>
+      </w:r>
+    </w:p>
+    <w:p>
+      <w:r>
+        <w:t xml:space="preserve">  • 没检测到气体 + 风向混乱 → 低信任（弱更新）</w:t>
+      </w:r>
+    </w:p>
+    <w:p>
+      <w:r>
+        <w:t>这个“信任度”不是拍脑袌调的参数，而是由风场置信度自动计算的。</w:t>
       </w:r>
     </w:p>
     <w:p>
@@ -169,28 +312,17 @@
     </w:p>
     <w:p>
       <w:r>
-        <w:t>以前的方法不知道什么时候该停——跑够300秒就停，或者靠经验。我设计了两个"裁判"同时监督：</w:t>
-      </w:r>
-    </w:p>
-    <w:p>
-      <w:pPr>
-        <w:pStyle w:val="ListBullet"/>
-      </w:pPr>
-      <w:r>
-        <w:t>• 裁判1（e-process）：数学上保证，如果我说"找到了"，出错概率不超过5%。</w:t>
-      </w:r>
-    </w:p>
-    <w:p>
-      <w:pPr>
-        <w:pStyle w:val="ListBullet"/>
-      </w:pPr>
-      <w:r>
-        <w:t>• 裁判2（DDM）：像大脑做决定一样，证据积累够了就停。</w:t>
+        <w:t>设计了两个“裁判”同时监督：</w:t>
       </w:r>
     </w:p>
     <w:p>
       <w:r>
-        <w:t>两个裁判任意一个说"可以停了"就停，保证又快又准。</w:t>
+        <w:t xml:space="preserve">  • 裁判1（e-process）：数学上保证，出错概率不超过5%。</w:t>
+      </w:r>
+    </w:p>
+    <w:p>
+      <w:r>
+        <w:t xml:space="preserve">  • 裁判2（DDM）：像大脑做决定一样，证据积累够了就停。</w:t>
       </w:r>
     </w:p>
     <w:p>
@@ -203,7 +335,7 @@
     </w:p>
     <w:p>
       <w:r>
-        <w:t>以前用指数衰减模型（离源越远检测概率指数下降），但实际室内气体是"近距离容易检测、远距离很难检测、中间有个陡变"的S形。我用logistic函数建模，更符合实际。</w:t>
+        <w:t>用logistic函数建模替代指数衰减，更符合室内气体扩散的S形检测概率特征。</w:t>
       </w:r>
     </w:p>
     <w:p>
@@ -216,7 +348,7 @@
     </w:p>
     <w:p>
       <w:r>
-        <w:t>气体源可能在地面也可能在空中。地面机器人只能在地面找，找空中源就废了。无人机可以飞，我用高斯过程模型自动学习"哪个高度气体浓度高"，飞到最可能有气体的高度去采样。</w:t>
+        <w:t>用高斯过程模型自动学习“哪个高度气体浓度高”，飞到最可能有气体的高度去采样。</w:t>
       </w:r>
     </w:p>
     <w:p>
@@ -224,7 +356,7 @@
         <w:pStyle w:val="Heading1"/>
       </w:pPr>
       <w:r>
-        <w:t>四、实验结果</w:t>
+        <w:t>五、实验结果</w:t>
       </w:r>
     </w:p>
     <w:p>
@@ -236,7 +368,6 @@
       <w:tblPr>
         <w:tblStyle w:val="LightGrid-Accent1"/>
         <w:tblW w:type="auto" w:w="0"/>
-        <w:jc w:val="center"/>
         <w:tblLook w:firstColumn="1" w:firstRow="1" w:lastColumn="0" w:lastRow="0" w:noHBand="0" w:noVBand="1" w:val="04A0"/>
       </w:tblPr>
       <w:tblGrid>
@@ -408,7 +539,7 @@
     <w:p/>
     <w:p>
       <w:r>
-        <w:t>简单说：我的方法比最好的对手误差低41%，成功率是它的3倍。特别是在"源在空中"的场景，其他方法全废（0%成功率），我还能保持90%+。</w:t>
+        <w:t>我的方法比最好的对手误差低41%，成功率是它的3倍。特别是在“源在空中”的场景，其他方法全废（0%成功率），我还能保持90%+。</w:t>
       </w:r>
     </w:p>
     <w:p>
@@ -416,51 +547,27 @@
         <w:pStyle w:val="Heading1"/>
       </w:pPr>
       <w:r>
-        <w:t>五、论文状态</w:t>
+        <w:t>六、论文状态</w:t>
       </w:r>
     </w:p>
     <w:p>
-      <w:pPr>
-        <w:pStyle w:val="ListBullet"/>
-      </w:pPr>
       <w:r>
-        <w:t>已完成：</w:t>
-      </w:r>
-      <w:r>
-        <w:t>理论框架、算法实现、160次基准实验、定理证明、论文初稿（中文8页/英文9页）</w:t>
+        <w:t>已完成：理论框架、算法实现、160次基准实验、定理证明、论文初稿</w:t>
       </w:r>
     </w:p>
     <w:p>
-      <w:pPr>
-        <w:pStyle w:val="ListBullet"/>
-      </w:pPr>
       <w:r>
-        <w:t>待完成：</w:t>
-      </w:r>
-      <w:r>
-        <w:t>消融实验（验证每个模块的贡献）、统计显著性检验、论文润色</w:t>
+        <w:t>待完成：消融实验、统计显著性检验、论文润色</w:t>
       </w:r>
     </w:p>
     <w:p>
-      <w:pPr>
-        <w:pStyle w:val="ListBullet"/>
-      </w:pPr>
       <w:r>
-        <w:t>预计投稿时间：</w:t>
-      </w:r>
-      <w:r>
-        <w:t>2026年8月</w:t>
+        <w:t>预计投稿时间：2026年8月</w:t>
       </w:r>
     </w:p>
     <w:p>
-      <w:pPr>
-        <w:pStyle w:val="ListBullet"/>
-      </w:pPr>
       <w:r>
-        <w:t>目标期刊：</w:t>
-      </w:r>
-      <w:r>
-        <w:t>IEEE Sensors Journal (IF ≈ 3.4)</w:t>
+        <w:t>目标期刊：IEEE Sensors Journal (IF ≈ 3.4)</w:t>
       </w:r>
     </w:p>
     <w:p>
@@ -468,29 +575,152 @@
         <w:pStyle w:val="Heading1"/>
       </w:pPr>
       <w:r>
-        <w:t>六、代码与数据</w:t>
+        <w:t>七、ISJ主编审查意见</w:t>
       </w:r>
     </w:p>
-    <w:p>
-      <w:r>
-        <w:t>• 代码仓库：https://github.com/kris-yun/cp-sbd-gsl (私有)</w:t>
-      </w:r>
-    </w:p>
-    <w:p>
-      <w:r>
-        <w:t>• 实验数据：160次完整基准测试结果已保存</w:t>
-      </w:r>
-    </w:p>
-    <w:p>
-      <w:r>
-        <w:t>• 仿真环境：GADEN丝状体气体扩散仿真器 + ROS2 Humble</w:t>
-      </w:r>
-    </w:p>
-    <w:p>
-      <w:r>
-        <w:t>• 运行平台：本地VM (zyc@192.168.111.128)</w:t>
-      </w:r>
-    </w:p>
+    <w:tbl>
+      <w:tblPr>
+        <w:tblStyle w:val="LightGrid-Accent1"/>
+        <w:tblW w:type="auto" w:w="0"/>
+        <w:tblLook w:firstColumn="1" w:firstRow="1" w:lastColumn="0" w:lastRow="0" w:noHBand="0" w:noVBand="1" w:val="04A0"/>
+      </w:tblPr>
+      <w:tblGrid>
+        <w:gridCol w:w="4320"/>
+        <w:gridCol w:w="4320"/>
+      </w:tblGrid>
+      <w:tr>
+        <w:tc>
+          <w:tcPr>
+            <w:tcW w:type="dxa" w:w="4320"/>
+          </w:tcPr>
+          <w:p>
+            <w:r>
+              <w:t>维度</w:t>
+            </w:r>
+          </w:p>
+        </w:tc>
+        <w:tc>
+          <w:tcPr>
+            <w:tcW w:type="dxa" w:w="4320"/>
+          </w:tcPr>
+          <w:p>
+            <w:r>
+              <w:t>评分与说明</w:t>
+            </w:r>
+          </w:p>
+        </w:tc>
+      </w:tr>
+      <w:tr>
+        <w:tc>
+          <w:tcPr>
+            <w:tcW w:type="dxa" w:w="4320"/>
+          </w:tcPr>
+          <w:p>
+            <w:r>
+              <w:t>创新性</w:t>
+            </w:r>
+          </w:p>
+        </w:tc>
+        <w:tc>
+          <w:tcPr>
+            <w:tcW w:type="dxa" w:w="4320"/>
+          </w:tcPr>
+          <w:p>
+            <w:r>
+              <w:t>7/10 — η作为状态变量+e-process停止有新意</w:t>
+            </w:r>
+          </w:p>
+        </w:tc>
+      </w:tr>
+      <w:tr>
+        <w:tc>
+          <w:tcPr>
+            <w:tcW w:type="dxa" w:w="4320"/>
+          </w:tcPr>
+          <w:p>
+            <w:r>
+              <w:t>理论深度</w:t>
+            </w:r>
+          </w:p>
+        </w:tc>
+        <w:tc>
+          <w:tcPr>
+            <w:tcW w:type="dxa" w:w="4320"/>
+          </w:tcPr>
+          <w:p>
+            <w:r>
+              <w:t>6.5/10 — 证明完整但技术较标准</w:t>
+            </w:r>
+          </w:p>
+        </w:tc>
+      </w:tr>
+      <w:tr>
+        <w:tc>
+          <w:tcPr>
+            <w:tcW w:type="dxa" w:w="4320"/>
+          </w:tcPr>
+          <w:p>
+            <w:r>
+              <w:t>实验</w:t>
+            </w:r>
+          </w:p>
+        </w:tc>
+        <w:tc>
+          <w:tcPr>
+            <w:tcW w:type="dxa" w:w="4320"/>
+          </w:tcPr>
+          <w:p>
+            <w:r>
+              <w:t>5/10 — 消融实验/统计检验/失败分析待补</w:t>
+            </w:r>
+          </w:p>
+        </w:tc>
+      </w:tr>
+      <w:tr>
+        <w:tc>
+          <w:tcPr>
+            <w:tcW w:type="dxa" w:w="4320"/>
+          </w:tcPr>
+          <w:p>
+            <w:r>
+              <w:t>写作</w:t>
+            </w:r>
+          </w:p>
+        </w:tc>
+        <w:tc>
+          <w:tcPr>
+            <w:tcW w:type="dxa" w:w="4320"/>
+          </w:tcPr>
+          <w:p>
+            <w:r>
+              <w:t>7/10 — 结构清晰，有未完成标记</w:t>
+            </w:r>
+          </w:p>
+        </w:tc>
+      </w:tr>
+      <w:tr>
+        <w:tc>
+          <w:tcPr>
+            <w:tcW w:type="dxa" w:w="4320"/>
+          </w:tcPr>
+          <w:p>
+            <w:r>
+              <w:t>总评</w:t>
+            </w:r>
+          </w:p>
+        </w:tc>
+        <w:tc>
+          <w:tcPr>
+            <w:tcW w:type="dxa" w:w="4320"/>
+          </w:tcPr>
+          <w:p>
+            <w:r>
+              <w:t>大修 — 补全实验后有希望</w:t>
+            </w:r>
+          </w:p>
+        </w:tc>
+      </w:tr>
+    </w:tbl>
     <w:sectPr>
       <w:pgSz w:w="12240" w:h="15840"/>
       <w:pgMar w:top="1440" w:right="1800" w:bottom="1440" w:left="1800" w:header="720" w:footer="720" w:gutter="0"/>
@@ -865,7 +1095,6 @@
     <w:qFormat/>
     <w:rsid w:val="00FC693F"/>
     <w:rPr>
-      <w:rFonts w:ascii="宋体" w:hAnsi="宋体"/>
       <w:sz w:val="24"/>
     </w:rPr>
   </w:style>

</xml_diff>